<commit_message>
docs: update project evaluation document
</commit_message>
<xml_diff>
--- a/ProjectEvaluation.docx
+++ b/ProjectEvaluation.docx
@@ -253,7 +253,7 @@
           <w:sz w:val="32"/>
           <w:szCs w:val="32"/>
         </w:rPr>
-        <w:t>Shrika SP Thota (3122235001125)</w:t>
+        <w:t>Meghna Manimaran (3122235001079)</w:t>
       </w:r>
     </w:p>
     <w:p>
@@ -272,7 +272,7 @@
           <w:sz w:val="32"/>
           <w:szCs w:val="32"/>
         </w:rPr>
-        <w:t>Meghna Manimaran (3122235001079)</w:t>
+        <w:t>Shrika SP Thota (3122235001125)</w:t>
       </w:r>
     </w:p>
     <w:p>
@@ -330,23 +330,13 @@
           <w:szCs w:val="32"/>
         </w:rPr>
       </w:pPr>
-      <w:proofErr w:type="spellStart"/>
       <w:r>
         <w:rPr>
           <w:rFonts w:ascii="Verdana" w:hAnsi="Verdana"/>
           <w:sz w:val="32"/>
           <w:szCs w:val="32"/>
         </w:rPr>
-        <w:t>Sujaudeen</w:t>
-      </w:r>
-      <w:proofErr w:type="spellEnd"/>
-      <w:r>
-        <w:rPr>
-          <w:rFonts w:ascii="Verdana" w:hAnsi="Verdana"/>
-          <w:sz w:val="32"/>
-          <w:szCs w:val="32"/>
-        </w:rPr>
-        <w:t xml:space="preserve"> N</w:t>
+        <w:t>Sujaudeen N</w:t>
       </w:r>
     </w:p>
     <w:p>
@@ -1264,21 +1254,12 @@
           <w:color w:val="000000" w:themeColor="text1"/>
         </w:rPr>
       </w:pPr>
-      <w:proofErr w:type="spellStart"/>
       <w:r>
         <w:rPr>
           <w:rFonts w:ascii="Verdana" w:eastAsia="Times New Roman" w:hAnsi="Verdana" w:cs="Times New Roman"/>
           <w:color w:val="000000" w:themeColor="text1"/>
         </w:rPr>
-        <w:t>Analyse</w:t>
-      </w:r>
-      <w:proofErr w:type="spellEnd"/>
-      <w:r>
-        <w:rPr>
-          <w:rFonts w:ascii="Verdana" w:eastAsia="Times New Roman" w:hAnsi="Verdana" w:cs="Times New Roman"/>
-          <w:color w:val="000000" w:themeColor="text1"/>
-        </w:rPr>
-        <w:t xml:space="preserve"> the related literature on the proposed problem and its feasibility (K4)</w:t>
+        <w:t>Analyse the related literature on the proposed problem and its feasibility (K4)</w:t>
       </w:r>
     </w:p>
     <w:p>
@@ -1375,21 +1356,12 @@
           <w:color w:val="000000" w:themeColor="text1"/>
         </w:rPr>
       </w:pPr>
-      <w:proofErr w:type="spellStart"/>
       <w:r>
         <w:rPr>
           <w:rFonts w:ascii="Verdana" w:eastAsia="Times New Roman" w:hAnsi="Verdana" w:cs="Times New Roman"/>
           <w:color w:val="000000" w:themeColor="text1"/>
         </w:rPr>
-        <w:t>Analyse</w:t>
-      </w:r>
-      <w:proofErr w:type="spellEnd"/>
-      <w:r>
-        <w:rPr>
-          <w:rFonts w:ascii="Verdana" w:eastAsia="Times New Roman" w:hAnsi="Verdana" w:cs="Times New Roman"/>
-          <w:color w:val="000000" w:themeColor="text1"/>
-        </w:rPr>
-        <w:t xml:space="preserve"> the issues pertaining to society, health, safety, legal, environment, culture applicable to the project and examine the impact of the proposed solution on these issues.</w:t>
+        <w:t>Analyse the issues pertaining to society, health, safety, legal, environment, culture applicable to the project and examine the impact of the proposed solution on these issues.</w:t>
       </w:r>
     </w:p>
     <w:p>
@@ -4267,25 +4239,7 @@
                 <w:sz w:val="12"/>
                 <w:szCs w:val="12"/>
               </w:rPr>
-              <w:t xml:space="preserve">Feasibility of implementing the proposed problem is </w:t>
-            </w:r>
-            <w:proofErr w:type="spellStart"/>
-            <w:r>
-              <w:rPr>
-                <w:rFonts w:ascii="Verdana" w:hAnsi="Verdana"/>
-                <w:sz w:val="12"/>
-                <w:szCs w:val="12"/>
-              </w:rPr>
-              <w:t>analysed</w:t>
-            </w:r>
-            <w:proofErr w:type="spellEnd"/>
-            <w:r>
-              <w:rPr>
-                <w:rFonts w:ascii="Verdana" w:hAnsi="Verdana"/>
-                <w:sz w:val="12"/>
-                <w:szCs w:val="12"/>
-              </w:rPr>
-              <w:t xml:space="preserve"> in depth.</w:t>
+              <w:t>Feasibility of implementing the proposed problem is analysed in depth.</w:t>
             </w:r>
           </w:p>
         </w:tc>
@@ -4316,25 +4270,7 @@
                 <w:sz w:val="12"/>
                 <w:szCs w:val="12"/>
               </w:rPr>
-              <w:t xml:space="preserve">Peer-reviewed research articles are summarized effectively. Gaps arising from the studies are identified. Feasibility of implementing the proposed problem is </w:t>
-            </w:r>
-            <w:proofErr w:type="spellStart"/>
-            <w:r>
-              <w:rPr>
-                <w:rFonts w:ascii="Verdana" w:hAnsi="Verdana"/>
-                <w:sz w:val="12"/>
-                <w:szCs w:val="12"/>
-              </w:rPr>
-              <w:t>analysed</w:t>
-            </w:r>
-            <w:proofErr w:type="spellEnd"/>
-            <w:r>
-              <w:rPr>
-                <w:rFonts w:ascii="Verdana" w:hAnsi="Verdana"/>
-                <w:sz w:val="12"/>
-                <w:szCs w:val="12"/>
-              </w:rPr>
-              <w:t xml:space="preserve"> at the satisfactory level</w:t>
+              <w:t>Peer-reviewed research articles are summarized effectively. Gaps arising from the studies are identified. Feasibility of implementing the proposed problem is analysed at the satisfactory level</w:t>
             </w:r>
           </w:p>
         </w:tc>
@@ -17436,43 +17372,7 @@
                 <w:sz w:val="16"/>
                 <w:szCs w:val="16"/>
               </w:rPr>
-              <w:t>The knowledge of sustainability (</w:t>
-            </w:r>
-            <w:proofErr w:type="spellStart"/>
-            <w:r>
-              <w:rPr>
-                <w:rFonts w:ascii="Verdana" w:eastAsia="Times New Roman" w:hAnsi="Verdana"/>
-                <w:sz w:val="16"/>
-                <w:szCs w:val="16"/>
-              </w:rPr>
-              <w:t>i.e</w:t>
-            </w:r>
-            <w:proofErr w:type="spellEnd"/>
-            <w:r>
-              <w:rPr>
-                <w:rFonts w:ascii="Verdana" w:eastAsia="Times New Roman" w:hAnsi="Verdana"/>
-                <w:sz w:val="16"/>
-                <w:szCs w:val="16"/>
-              </w:rPr>
-              <w:t xml:space="preserve"> reusability, developed system is sustainable for technology change </w:t>
-            </w:r>
-            <w:proofErr w:type="spellStart"/>
-            <w:r>
-              <w:rPr>
-                <w:rFonts w:ascii="Verdana" w:eastAsia="Times New Roman" w:hAnsi="Verdana"/>
-                <w:sz w:val="16"/>
-                <w:szCs w:val="16"/>
-              </w:rPr>
-              <w:t>etc</w:t>
-            </w:r>
-            <w:proofErr w:type="spellEnd"/>
-            <w:r>
-              <w:rPr>
-                <w:rFonts w:ascii="Verdana" w:eastAsia="Times New Roman" w:hAnsi="Verdana"/>
-                <w:sz w:val="16"/>
-                <w:szCs w:val="16"/>
-              </w:rPr>
-              <w:t>) related to their project work is sound</w:t>
+              <w:t>The knowledge of sustainability (i.e reusability, developed system is sustainable for technology change etc) related to their project work is sound</w:t>
             </w:r>
           </w:p>
         </w:tc>
@@ -17509,43 +17409,7 @@
                 <w:sz w:val="16"/>
                 <w:szCs w:val="16"/>
               </w:rPr>
-              <w:t>The knowledge of sustainability (</w:t>
-            </w:r>
-            <w:proofErr w:type="spellStart"/>
-            <w:r>
-              <w:rPr>
-                <w:rFonts w:ascii="Verdana" w:eastAsia="Times New Roman" w:hAnsi="Verdana"/>
-                <w:sz w:val="16"/>
-                <w:szCs w:val="16"/>
-              </w:rPr>
-              <w:t>i.e</w:t>
-            </w:r>
-            <w:proofErr w:type="spellEnd"/>
-            <w:r>
-              <w:rPr>
-                <w:rFonts w:ascii="Verdana" w:eastAsia="Times New Roman" w:hAnsi="Verdana"/>
-                <w:sz w:val="16"/>
-                <w:szCs w:val="16"/>
-              </w:rPr>
-              <w:t xml:space="preserve"> reusability, developed system is sustainable for technology change </w:t>
-            </w:r>
-            <w:proofErr w:type="spellStart"/>
-            <w:r>
-              <w:rPr>
-                <w:rFonts w:ascii="Verdana" w:eastAsia="Times New Roman" w:hAnsi="Verdana"/>
-                <w:sz w:val="16"/>
-                <w:szCs w:val="16"/>
-              </w:rPr>
-              <w:t>etc</w:t>
-            </w:r>
-            <w:proofErr w:type="spellEnd"/>
-            <w:r>
-              <w:rPr>
-                <w:rFonts w:ascii="Verdana" w:eastAsia="Times New Roman" w:hAnsi="Verdana"/>
-                <w:sz w:val="16"/>
-                <w:szCs w:val="16"/>
-              </w:rPr>
-              <w:t>) related to their project work is reasonable.</w:t>
+              <w:t>The knowledge of sustainability (i.e reusability, developed system is sustainable for technology change etc) related to their project work is reasonable.</w:t>
             </w:r>
           </w:p>
         </w:tc>
@@ -17582,43 +17446,7 @@
                 <w:sz w:val="16"/>
                 <w:szCs w:val="16"/>
               </w:rPr>
-              <w:t>The knowledge of sustainability (</w:t>
-            </w:r>
-            <w:proofErr w:type="spellStart"/>
-            <w:r>
-              <w:rPr>
-                <w:rFonts w:ascii="Verdana" w:eastAsia="Times New Roman" w:hAnsi="Verdana"/>
-                <w:sz w:val="16"/>
-                <w:szCs w:val="16"/>
-              </w:rPr>
-              <w:t>i.e</w:t>
-            </w:r>
-            <w:proofErr w:type="spellEnd"/>
-            <w:r>
-              <w:rPr>
-                <w:rFonts w:ascii="Verdana" w:eastAsia="Times New Roman" w:hAnsi="Verdana"/>
-                <w:sz w:val="16"/>
-                <w:szCs w:val="16"/>
-              </w:rPr>
-              <w:t xml:space="preserve"> reusability, developed system is sustainable for technology change </w:t>
-            </w:r>
-            <w:proofErr w:type="spellStart"/>
-            <w:r>
-              <w:rPr>
-                <w:rFonts w:ascii="Verdana" w:eastAsia="Times New Roman" w:hAnsi="Verdana"/>
-                <w:sz w:val="16"/>
-                <w:szCs w:val="16"/>
-              </w:rPr>
-              <w:t>etc</w:t>
-            </w:r>
-            <w:proofErr w:type="spellEnd"/>
-            <w:r>
-              <w:rPr>
-                <w:rFonts w:ascii="Verdana" w:eastAsia="Times New Roman" w:hAnsi="Verdana"/>
-                <w:sz w:val="16"/>
-                <w:szCs w:val="16"/>
-              </w:rPr>
-              <w:t>)</w:t>
+              <w:t>The knowledge of sustainability (i.e reusability, developed system is sustainable for technology change etc)</w:t>
             </w:r>
             <w:r>
               <w:rPr>
@@ -17671,43 +17499,7 @@
                 <w:sz w:val="16"/>
                 <w:szCs w:val="16"/>
               </w:rPr>
-              <w:t>The knowledge of sustainability (</w:t>
-            </w:r>
-            <w:proofErr w:type="spellStart"/>
-            <w:r>
-              <w:rPr>
-                <w:rFonts w:ascii="Verdana" w:eastAsia="Times New Roman" w:hAnsi="Verdana"/>
-                <w:sz w:val="16"/>
-                <w:szCs w:val="16"/>
-              </w:rPr>
-              <w:t>i.e</w:t>
-            </w:r>
-            <w:proofErr w:type="spellEnd"/>
-            <w:r>
-              <w:rPr>
-                <w:rFonts w:ascii="Verdana" w:eastAsia="Times New Roman" w:hAnsi="Verdana"/>
-                <w:sz w:val="16"/>
-                <w:szCs w:val="16"/>
-              </w:rPr>
-              <w:t xml:space="preserve"> reusability, developed system is sustainable for technology change </w:t>
-            </w:r>
-            <w:proofErr w:type="spellStart"/>
-            <w:r>
-              <w:rPr>
-                <w:rFonts w:ascii="Verdana" w:eastAsia="Times New Roman" w:hAnsi="Verdana"/>
-                <w:sz w:val="16"/>
-                <w:szCs w:val="16"/>
-              </w:rPr>
-              <w:t>etc</w:t>
-            </w:r>
-            <w:proofErr w:type="spellEnd"/>
-            <w:r>
-              <w:rPr>
-                <w:rFonts w:ascii="Verdana" w:eastAsia="Times New Roman" w:hAnsi="Verdana"/>
-                <w:sz w:val="16"/>
-                <w:szCs w:val="16"/>
-              </w:rPr>
-              <w:t>)</w:t>
+              <w:t>The knowledge of sustainability (i.e reusability, developed system is sustainable for technology change etc)</w:t>
             </w:r>
             <w:r>
               <w:rPr>
@@ -22397,25 +22189,7 @@
           <w:sz w:val="22"/>
           <w:szCs w:val="22"/>
         </w:rPr>
-        <w:t xml:space="preserve">To develop the ability to solve a specific problem right from its identification and liter- </w:t>
-      </w:r>
-      <w:proofErr w:type="spellStart"/>
-      <w:r>
-        <w:rPr>
-          <w:rFonts w:ascii="Verdana" w:eastAsia="Times New Roman" w:hAnsi="Verdana"/>
-          <w:sz w:val="22"/>
-          <w:szCs w:val="22"/>
-        </w:rPr>
-        <w:t>ature</w:t>
-      </w:r>
-      <w:proofErr w:type="spellEnd"/>
-      <w:r>
-        <w:rPr>
-          <w:rFonts w:ascii="Verdana" w:eastAsia="Times New Roman" w:hAnsi="Verdana"/>
-          <w:sz w:val="22"/>
-          <w:szCs w:val="22"/>
-        </w:rPr>
-        <w:t xml:space="preserve"> review till the successful solution of the same.</w:t>
+        <w:t>To develop the ability to solve a specific problem right from its identification and liter- ature review till the successful solution of the same.</w:t>
       </w:r>
     </w:p>
     <w:p>
@@ -27858,23 +27632,13 @@
                 <w:szCs w:val="20"/>
               </w:rPr>
             </w:pPr>
-            <w:proofErr w:type="spellStart"/>
-            <w:r>
-              <w:rPr>
-                <w:rFonts w:ascii="Verdana" w:hAnsi="Verdana"/>
-                <w:sz w:val="20"/>
-                <w:szCs w:val="20"/>
-              </w:rPr>
-              <w:t>Analyse</w:t>
-            </w:r>
-            <w:proofErr w:type="spellEnd"/>
-            <w:r>
-              <w:rPr>
-                <w:rFonts w:ascii="Verdana" w:hAnsi="Verdana"/>
-                <w:sz w:val="20"/>
-                <w:szCs w:val="20"/>
-              </w:rPr>
-              <w:t xml:space="preserve"> the impact of the proposed solution on the issues pertaining to society, health, safety, legal, </w:t>
+            <w:r>
+              <w:rPr>
+                <w:rFonts w:ascii="Verdana" w:hAnsi="Verdana"/>
+                <w:sz w:val="20"/>
+                <w:szCs w:val="20"/>
+              </w:rPr>
+              <w:t xml:space="preserve">Analyse the impact of the proposed solution on the issues pertaining to society, health, safety, legal, </w:t>
             </w:r>
             <w:r>
               <w:rPr>

</xml_diff>

<commit_message>
chore(docs): Updated Guide Name in Docs
</commit_message>
<xml_diff>
--- a/ProjectEvaluation.docx
+++ b/ProjectEvaluation.docx
@@ -336,7 +336,15 @@
           <w:sz w:val="32"/>
           <w:szCs w:val="32"/>
         </w:rPr>
-        <w:t>Sujaudeen N</w:t>
+        <w:t xml:space="preserve">Dr. N. </w:t>
+      </w:r>
+      <w:r>
+        <w:rPr>
+          <w:rFonts w:ascii="Verdana" w:hAnsi="Verdana"/>
+          <w:sz w:val="32"/>
+          <w:szCs w:val="32"/>
+        </w:rPr>
+        <w:t>Sujaudeen</w:t>
       </w:r>
     </w:p>
     <w:p>

</xml_diff>